<commit_message>
Modifying the Order Cards in History Order Page
</commit_message>
<xml_diff>
--- a/finishing with the last fixes.docx
+++ b/finishing with the last fixes.docx
@@ -63,46 +63,155 @@
         <w:rPr>
           <w:lang w:val="en-US"/>
         </w:rPr>
-        <w:t>3. Test in the product number in the cart the difference in UI between xx and (xx).</w:t>
-      </w:r>
-    </w:p>
-    <w:p>
-      <w:pPr>
-        <w:rPr>
-          <w:lang w:val="en-US"/>
-        </w:rPr>
-      </w:pPr>
-      <w:r>
-        <w:rPr>
-          <w:lang w:val="en-US"/>
-        </w:rPr>
-        <w:t>4. In Product Detail Page don’t show missing optional fields.</w:t>
-      </w:r>
-    </w:p>
-    <w:p>
-      <w:pPr>
-        <w:rPr>
-          <w:lang w:val="en-US"/>
-        </w:rPr>
-      </w:pPr>
-      <w:r>
-        <w:rPr>
-          <w:lang w:val="en-US"/>
-        </w:rPr>
-        <w:t>5. Improve the Checkout saving old data from the user in Checkout state.</w:t>
-      </w:r>
-    </w:p>
-    <w:p>
-      <w:pPr>
-        <w:rPr>
-          <w:lang w:val="en-US"/>
-        </w:rPr>
-      </w:pPr>
-      <w:r>
-        <w:rPr>
-          <w:lang w:val="en-US"/>
-        </w:rPr>
-        <w:t>6. Improve Order Success Page.</w:t>
+        <w:t>3. Test in the product number in the cart the difference in UI between xx and (xx)</w:t>
+      </w:r>
+      <w:r>
+        <w:rPr>
+          <w:lang w:val="en-US"/>
+        </w:rPr>
+        <w:t xml:space="preserve"> [LATER]</w:t>
+      </w:r>
+      <w:r>
+        <w:rPr>
+          <w:lang w:val="en-US"/>
+        </w:rPr>
+        <w:t>.</w:t>
+      </w:r>
+    </w:p>
+    <w:p>
+      <w:pPr>
+        <w:rPr>
+          <w:lang w:val="en-US"/>
+        </w:rPr>
+      </w:pPr>
+      <w:r>
+        <w:rPr>
+          <w:lang w:val="en-US"/>
+        </w:rPr>
+        <w:t>4. In Product Detail Page don’t show missing optional fields</w:t>
+      </w:r>
+      <w:r>
+        <w:rPr>
+          <w:lang w:val="en-US"/>
+        </w:rPr>
+        <w:t xml:space="preserve"> [UNNECESARY]</w:t>
+      </w:r>
+      <w:r>
+        <w:rPr>
+          <w:lang w:val="en-US"/>
+        </w:rPr>
+        <w:t>.</w:t>
+      </w:r>
+    </w:p>
+    <w:p>
+      <w:pPr>
+        <w:rPr>
+          <w:lang w:val="en-US"/>
+        </w:rPr>
+      </w:pPr>
+      <w:r>
+        <w:rPr>
+          <w:lang w:val="en-US"/>
+        </w:rPr>
+        <w:t>5. Improve the Checkout saving old data from the user in Checkou</w:t>
+      </w:r>
+      <w:r>
+        <w:rPr>
+          <w:lang w:val="en-US"/>
+        </w:rPr>
+        <w:t>t</w:t>
+      </w:r>
+      <w:r>
+        <w:rPr>
+          <w:lang w:val="en-US"/>
+        </w:rPr>
+        <w:t xml:space="preserve"> state</w:t>
+      </w:r>
+      <w:r>
+        <w:rPr>
+          <w:lang w:val="en-US"/>
+        </w:rPr>
+        <w:t xml:space="preserve"> [DONE]</w:t>
+      </w:r>
+      <w:r>
+        <w:rPr>
+          <w:lang w:val="en-US"/>
+        </w:rPr>
+        <w:t>.</w:t>
+      </w:r>
+    </w:p>
+    <w:p>
+      <w:pPr>
+        <w:rPr>
+          <w:lang w:val="en-US"/>
+        </w:rPr>
+      </w:pPr>
+      <w:r>
+        <w:rPr>
+          <w:lang w:val="en-US"/>
+        </w:rPr>
+        <w:t>5</w:t>
+      </w:r>
+      <w:r>
+        <w:rPr>
+          <w:lang w:val="en-US"/>
+        </w:rPr>
+        <w:t>.1</w:t>
+      </w:r>
+      <w:r>
+        <w:rPr>
+          <w:lang w:val="en-US"/>
+        </w:rPr>
+        <w:t>. Improve the Checkout saving old data from the user in Checkout</w:t>
+      </w:r>
+      <w:r>
+        <w:rPr>
+          <w:lang w:val="en-US"/>
+        </w:rPr>
+        <w:t xml:space="preserve"> Payment Method</w:t>
+      </w:r>
+      <w:r>
+        <w:rPr>
+          <w:lang w:val="en-US"/>
+        </w:rPr>
+        <w:t xml:space="preserve"> state</w:t>
+      </w:r>
+      <w:r>
+        <w:rPr>
+          <w:lang w:val="en-US"/>
+        </w:rPr>
+        <w:t xml:space="preserve"> [DONE]</w:t>
+      </w:r>
+      <w:r>
+        <w:rPr>
+          <w:lang w:val="en-US"/>
+        </w:rPr>
+        <w:t>.</w:t>
+      </w:r>
+    </w:p>
+    <w:p>
+      <w:pPr>
+        <w:rPr>
+          <w:lang w:val="en-US"/>
+        </w:rPr>
+      </w:pPr>
+      <w:r>
+        <w:rPr>
+          <w:lang w:val="en-US"/>
+        </w:rPr>
+        <w:t>6. Improve Order Success Page</w:t>
+      </w:r>
+      <w:r>
+        <w:rPr>
+          <w:lang w:val="en-US"/>
+        </w:rPr>
+        <w:t xml:space="preserve"> [DONE]</w:t>
+      </w:r>
+      <w:r>
+        <w:rPr>
+          <w:lang w:val="en-US"/>
+        </w:rPr>
+        <w:t>.</w:t>
       </w:r>
     </w:p>
     <w:p>
@@ -116,6 +225,19 @@
           <w:lang w:val="en-US"/>
         </w:rPr>
         <w:t>7. Make clickable the Order Cards to navigate to /profile/orders or even to /profile/orders/:id.</w:t>
+      </w:r>
+    </w:p>
+    <w:p>
+      <w:pPr>
+        <w:rPr>
+          <w:lang w:val="en-US"/>
+        </w:rPr>
+      </w:pPr>
+      <w:r>
+        <w:rPr>
+          <w:lang w:val="en-US"/>
+        </w:rPr>
+        <w:t>8. If the user isn’t logged, he/she can’t buy any product.</w:t>
       </w:r>
     </w:p>
     <w:p>
@@ -314,7 +436,7 @@
     <w:p>
       <w:r>
         <w:pict w14:anchorId="7DE153AF">
-          <v:rect id="_x0000_i1043" style="width:0;height:1.5pt" o:hralign="center" o:hrstd="t" o:hr="t" fillcolor="#a0a0a0" stroked="f"/>
+          <v:rect id="_x0000_i1025" style="width:0;height:1.5pt" o:hralign="center" o:hrstd="t" o:hr="t" fillcolor="#a0a0a0" stroked="f"/>
         </w:pict>
       </w:r>
     </w:p>
@@ -442,7 +564,7 @@
     <w:p>
       <w:r>
         <w:pict w14:anchorId="48545098">
-          <v:rect id="_x0000_i1044" style="width:0;height:1.5pt" o:hralign="center" o:hrstd="t" o:hr="t" fillcolor="#a0a0a0" stroked="f"/>
+          <v:rect id="_x0000_i1026" style="width:0;height:1.5pt" o:hralign="center" o:hrstd="t" o:hr="t" fillcolor="#a0a0a0" stroked="f"/>
         </w:pict>
       </w:r>
     </w:p>
@@ -459,6 +581,7 @@
           <w:b/>
           <w:bCs/>
         </w:rPr>
+        <w:lastRenderedPageBreak/>
         <w:t>Phase</w:t>
       </w:r>
       <w:proofErr w:type="spellEnd"/>
@@ -595,9 +718,8 @@
     </w:p>
     <w:p>
       <w:r>
-        <w:lastRenderedPageBreak/>
         <w:pict w14:anchorId="65A49FF9">
-          <v:rect id="_x0000_i1045" style="width:0;height:1.5pt" o:hralign="center" o:hrstd="t" o:hr="t" fillcolor="#a0a0a0" stroked="f"/>
+          <v:rect id="_x0000_i1027" style="width:0;height:1.5pt" o:hralign="center" o:hrstd="t" o:hr="t" fillcolor="#a0a0a0" stroked="f"/>
         </w:pict>
       </w:r>
     </w:p>
@@ -1574,6 +1696,7 @@
   <w:style w:type="character" w:default="1" w:styleId="Fuentedeprrafopredeter">
     <w:name w:val="Default Paragraph Font"/>
     <w:uiPriority w:val="1"/>
+    <w:semiHidden/>
     <w:unhideWhenUsed/>
   </w:style>
   <w:style w:type="table" w:default="1" w:styleId="Tablanormal">

</xml_diff>

<commit_message>
Creating the Sign Up feature
</commit_message>
<xml_diff>
--- a/finishing with the last fixes.docx
+++ b/finishing with the last fixes.docx
@@ -150,19 +150,7 @@
         <w:rPr>
           <w:lang w:val="en-US"/>
         </w:rPr>
-        <w:t>5</w:t>
-      </w:r>
-      <w:r>
-        <w:rPr>
-          <w:lang w:val="en-US"/>
-        </w:rPr>
-        <w:t>.1</w:t>
-      </w:r>
-      <w:r>
-        <w:rPr>
-          <w:lang w:val="en-US"/>
-        </w:rPr>
-        <w:t>. Improve the Checkout saving old data from the user in Checkout</w:t>
+        <w:t>5.1. Improve the Checkout saving old data from the user in Checkout</w:t>
       </w:r>
       <w:r>
         <w:rPr>
@@ -224,20 +212,44 @@
         <w:rPr>
           <w:lang w:val="en-US"/>
         </w:rPr>
-        <w:t>7. Make clickable the Order Cards to navigate to /profile/orders or even to /profile/orders/:id.</w:t>
-      </w:r>
-    </w:p>
-    <w:p>
-      <w:pPr>
-        <w:rPr>
-          <w:lang w:val="en-US"/>
-        </w:rPr>
-      </w:pPr>
-      <w:r>
-        <w:rPr>
-          <w:lang w:val="en-US"/>
-        </w:rPr>
-        <w:t>8. If the user isn’t logged, he/she can’t buy any product.</w:t>
+        <w:t>7. Make clickable the Order Cards to navigate to /profile/orders or even to /profile/orders/:id</w:t>
+      </w:r>
+      <w:r>
+        <w:rPr>
+          <w:lang w:val="en-US"/>
+        </w:rPr>
+        <w:t xml:space="preserve"> [DONE]</w:t>
+      </w:r>
+      <w:r>
+        <w:rPr>
+          <w:lang w:val="en-US"/>
+        </w:rPr>
+        <w:t>.</w:t>
+      </w:r>
+    </w:p>
+    <w:p>
+      <w:pPr>
+        <w:rPr>
+          <w:lang w:val="en-US"/>
+        </w:rPr>
+      </w:pPr>
+      <w:r>
+        <w:rPr>
+          <w:lang w:val="en-US"/>
+        </w:rPr>
+        <w:t>8. If the user isn’t logged, he/she can’t buy any product</w:t>
+      </w:r>
+      <w:r>
+        <w:rPr>
+          <w:lang w:val="en-US"/>
+        </w:rPr>
+        <w:t xml:space="preserve"> [DONE]</w:t>
+      </w:r>
+      <w:r>
+        <w:rPr>
+          <w:lang w:val="en-US"/>
+        </w:rPr>
+        <w:t>.</w:t>
       </w:r>
     </w:p>
     <w:p>
@@ -298,37 +310,12 @@
           <w:bCs/>
         </w:rPr>
       </w:pPr>
-      <w:proofErr w:type="spellStart"/>
       <w:r>
         <w:rPr>
           <w:b/>
           <w:bCs/>
         </w:rPr>
-        <w:t>Phase</w:t>
-      </w:r>
-      <w:proofErr w:type="spellEnd"/>
-      <w:r>
-        <w:rPr>
-          <w:b/>
-          <w:bCs/>
-        </w:rPr>
-        <w:t xml:space="preserve"> 1 (</w:t>
-      </w:r>
-      <w:proofErr w:type="spellStart"/>
-      <w:r>
-        <w:rPr>
-          <w:b/>
-          <w:bCs/>
-        </w:rPr>
-        <w:t>Mandatory</w:t>
-      </w:r>
-      <w:proofErr w:type="spellEnd"/>
-      <w:r>
-        <w:rPr>
-          <w:b/>
-          <w:bCs/>
-        </w:rPr>
-        <w:t>)</w:t>
+        <w:t>Phase 1 (Mandatory)</w:t>
       </w:r>
     </w:p>
     <w:p>
@@ -339,15 +326,7 @@
         </w:numPr>
       </w:pPr>
       <w:r>
-        <w:t xml:space="preserve">Orders V2 data </w:t>
-      </w:r>
-      <w:proofErr w:type="spellStart"/>
-      <w:r>
-        <w:t>model</w:t>
-      </w:r>
-      <w:proofErr w:type="spellEnd"/>
-      <w:r>
-        <w:t xml:space="preserve"> </w:t>
+        <w:t xml:space="preserve">Orders V2 data model </w:t>
       </w:r>
     </w:p>
     <w:p>
@@ -358,23 +337,7 @@
         </w:numPr>
       </w:pPr>
       <w:r>
-        <w:t xml:space="preserve">Orders </w:t>
-      </w:r>
-      <w:proofErr w:type="spellStart"/>
-      <w:r>
-        <w:t>service</w:t>
-      </w:r>
-      <w:proofErr w:type="spellEnd"/>
-      <w:r>
-        <w:t xml:space="preserve"> </w:t>
-      </w:r>
-      <w:proofErr w:type="spellStart"/>
-      <w:r>
-        <w:t>update</w:t>
-      </w:r>
-      <w:proofErr w:type="spellEnd"/>
-      <w:r>
-        <w:t xml:space="preserve"> </w:t>
+        <w:t xml:space="preserve">Orders service update </w:t>
       </w:r>
     </w:p>
     <w:p>
@@ -384,21 +347,8 @@
           <w:numId w:val="1"/>
         </w:numPr>
       </w:pPr>
-      <w:proofErr w:type="spellStart"/>
-      <w:r>
-        <w:t>OrderCard</w:t>
-      </w:r>
-      <w:proofErr w:type="spellEnd"/>
-      <w:r>
-        <w:t xml:space="preserve"> </w:t>
-      </w:r>
-      <w:proofErr w:type="spellStart"/>
-      <w:r>
-        <w:t>update</w:t>
-      </w:r>
-      <w:proofErr w:type="spellEnd"/>
-      <w:r>
-        <w:t xml:space="preserve"> </w:t>
+      <w:r>
+        <w:t xml:space="preserve">OrderCard update </w:t>
       </w:r>
     </w:p>
     <w:p>
@@ -408,29 +358,8 @@
           <w:numId w:val="1"/>
         </w:numPr>
       </w:pPr>
-      <w:proofErr w:type="spellStart"/>
-      <w:r>
-        <w:t>Checkout</w:t>
-      </w:r>
-      <w:proofErr w:type="spellEnd"/>
-      <w:r>
-        <w:t xml:space="preserve"> </w:t>
-      </w:r>
-      <w:proofErr w:type="spellStart"/>
-      <w:r>
-        <w:t>success</w:t>
-      </w:r>
-      <w:proofErr w:type="spellEnd"/>
-      <w:r>
-        <w:t xml:space="preserve"> </w:t>
-      </w:r>
-      <w:proofErr w:type="spellStart"/>
-      <w:r>
-        <w:t>order</w:t>
-      </w:r>
-      <w:proofErr w:type="spellEnd"/>
-      <w:r>
-        <w:t xml:space="preserve"> ID </w:t>
+      <w:r>
+        <w:t xml:space="preserve">Checkout success order ID </w:t>
       </w:r>
     </w:p>
     <w:p>
@@ -447,21 +376,12 @@
           <w:bCs/>
         </w:rPr>
       </w:pPr>
-      <w:proofErr w:type="spellStart"/>
       <w:r>
         <w:rPr>
           <w:b/>
           <w:bCs/>
         </w:rPr>
-        <w:t>Phase</w:t>
-      </w:r>
-      <w:proofErr w:type="spellEnd"/>
-      <w:r>
-        <w:rPr>
-          <w:b/>
-          <w:bCs/>
-        </w:rPr>
-        <w:t xml:space="preserve"> 2 (30 minutes)</w:t>
+        <w:t>Phase 2 (30 minutes)</w:t>
       </w:r>
     </w:p>
     <w:p>
@@ -472,31 +392,7 @@
         </w:numPr>
       </w:pPr>
       <w:r>
-        <w:t xml:space="preserve">Preserve </w:t>
-      </w:r>
-      <w:proofErr w:type="spellStart"/>
-      <w:r>
-        <w:t>shipping</w:t>
-      </w:r>
-      <w:proofErr w:type="spellEnd"/>
-      <w:r>
-        <w:t xml:space="preserve"> </w:t>
-      </w:r>
-      <w:proofErr w:type="spellStart"/>
-      <w:r>
-        <w:t>form</w:t>
-      </w:r>
-      <w:proofErr w:type="spellEnd"/>
-      <w:r>
-        <w:t xml:space="preserve"> </w:t>
-      </w:r>
-      <w:proofErr w:type="spellStart"/>
-      <w:r>
-        <w:t>values</w:t>
-      </w:r>
-      <w:proofErr w:type="spellEnd"/>
-      <w:r>
-        <w:t xml:space="preserve"> </w:t>
+        <w:t xml:space="preserve">Preserve shipping form values </w:t>
       </w:r>
     </w:p>
     <w:p>
@@ -507,23 +403,7 @@
         </w:numPr>
       </w:pPr>
       <w:r>
-        <w:t xml:space="preserve">Preserve </w:t>
-      </w:r>
-      <w:proofErr w:type="spellStart"/>
-      <w:r>
-        <w:t>payment</w:t>
-      </w:r>
-      <w:proofErr w:type="spellEnd"/>
-      <w:r>
-        <w:t xml:space="preserve"> </w:t>
-      </w:r>
-      <w:proofErr w:type="spellStart"/>
-      <w:r>
-        <w:t>values</w:t>
-      </w:r>
-      <w:proofErr w:type="spellEnd"/>
-      <w:r>
-        <w:t xml:space="preserve"> </w:t>
+        <w:t xml:space="preserve">Preserve payment values </w:t>
       </w:r>
     </w:p>
     <w:p>
@@ -534,31 +414,7 @@
         </w:numPr>
       </w:pPr>
       <w:r>
-        <w:t xml:space="preserve">Hide </w:t>
-      </w:r>
-      <w:proofErr w:type="spellStart"/>
-      <w:r>
-        <w:t>undefined</w:t>
-      </w:r>
-      <w:proofErr w:type="spellEnd"/>
-      <w:r>
-        <w:t xml:space="preserve"> </w:t>
-      </w:r>
-      <w:proofErr w:type="spellStart"/>
-      <w:r>
-        <w:t>product</w:t>
-      </w:r>
-      <w:proofErr w:type="spellEnd"/>
-      <w:r>
-        <w:t xml:space="preserve"> </w:t>
-      </w:r>
-      <w:proofErr w:type="spellStart"/>
-      <w:r>
-        <w:t>fields</w:t>
-      </w:r>
-      <w:proofErr w:type="spellEnd"/>
-      <w:r>
-        <w:t xml:space="preserve"> </w:t>
+        <w:t xml:space="preserve">Hide undefined product fields </w:t>
       </w:r>
     </w:p>
     <w:p>
@@ -575,38 +431,13 @@
           <w:bCs/>
         </w:rPr>
       </w:pPr>
-      <w:proofErr w:type="spellStart"/>
       <w:r>
         <w:rPr>
           <w:b/>
           <w:bCs/>
         </w:rPr>
         <w:lastRenderedPageBreak/>
-        <w:t>Phase</w:t>
-      </w:r>
-      <w:proofErr w:type="spellEnd"/>
-      <w:r>
-        <w:rPr>
-          <w:b/>
-          <w:bCs/>
-        </w:rPr>
-        <w:t xml:space="preserve"> 3 (</w:t>
-      </w:r>
-      <w:proofErr w:type="spellStart"/>
-      <w:r>
-        <w:rPr>
-          <w:b/>
-          <w:bCs/>
-        </w:rPr>
-        <w:t>Optional</w:t>
-      </w:r>
-      <w:proofErr w:type="spellEnd"/>
-      <w:r>
-        <w:rPr>
-          <w:b/>
-          <w:bCs/>
-        </w:rPr>
-        <w:t>)</w:t>
+        <w:t>Phase 3 (Optional)</w:t>
       </w:r>
     </w:p>
     <w:p>
@@ -617,23 +448,7 @@
         </w:numPr>
       </w:pPr>
       <w:r>
-        <w:t xml:space="preserve">Better </w:t>
-      </w:r>
-      <w:proofErr w:type="spellStart"/>
-      <w:r>
-        <w:t>cart</w:t>
-      </w:r>
-      <w:proofErr w:type="spellEnd"/>
-      <w:r>
-        <w:t xml:space="preserve"> </w:t>
-      </w:r>
-      <w:proofErr w:type="spellStart"/>
-      <w:r>
-        <w:t>badge</w:t>
-      </w:r>
-      <w:proofErr w:type="spellEnd"/>
-      <w:r>
-        <w:t xml:space="preserve"> </w:t>
+        <w:t xml:space="preserve">Better cart badge </w:t>
       </w:r>
     </w:p>
     <w:p>
@@ -643,37 +458,8 @@
           <w:numId w:val="3"/>
         </w:numPr>
       </w:pPr>
-      <w:proofErr w:type="spellStart"/>
-      <w:r>
-        <w:t>Recent</w:t>
-      </w:r>
-      <w:proofErr w:type="spellEnd"/>
-      <w:r>
-        <w:t xml:space="preserve"> 3 </w:t>
-      </w:r>
-      <w:proofErr w:type="spellStart"/>
-      <w:r>
-        <w:t>orders</w:t>
-      </w:r>
-      <w:proofErr w:type="spellEnd"/>
-      <w:r>
-        <w:t xml:space="preserve"> </w:t>
-      </w:r>
-      <w:proofErr w:type="spellStart"/>
-      <w:r>
-        <w:t>on</w:t>
-      </w:r>
-      <w:proofErr w:type="spellEnd"/>
-      <w:r>
-        <w:t xml:space="preserve"> </w:t>
-      </w:r>
-      <w:proofErr w:type="spellStart"/>
-      <w:r>
-        <w:t>profile</w:t>
-      </w:r>
-      <w:proofErr w:type="spellEnd"/>
-      <w:r>
-        <w:t xml:space="preserve"> </w:t>
+      <w:r>
+        <w:t xml:space="preserve">Recent 3 orders on profile </w:t>
       </w:r>
     </w:p>
     <w:p>
@@ -683,37 +469,8 @@
           <w:numId w:val="3"/>
         </w:numPr>
       </w:pPr>
-      <w:proofErr w:type="spellStart"/>
-      <w:r>
-        <w:t>Order</w:t>
-      </w:r>
-      <w:proofErr w:type="spellEnd"/>
-      <w:r>
-        <w:t xml:space="preserve"> </w:t>
-      </w:r>
-      <w:proofErr w:type="spellStart"/>
-      <w:r>
-        <w:t>card</w:t>
-      </w:r>
-      <w:proofErr w:type="spellEnd"/>
-      <w:r>
-        <w:t xml:space="preserve"> </w:t>
-      </w:r>
-      <w:proofErr w:type="spellStart"/>
-      <w:r>
-        <w:t>click</w:t>
-      </w:r>
-      <w:proofErr w:type="spellEnd"/>
-      <w:r>
-        <w:t xml:space="preserve"> </w:t>
-      </w:r>
-      <w:proofErr w:type="spellStart"/>
-      <w:r>
-        <w:t>behavior</w:t>
-      </w:r>
-      <w:proofErr w:type="spellEnd"/>
-      <w:r>
-        <w:t xml:space="preserve"> </w:t>
+      <w:r>
+        <w:t xml:space="preserve">Order card click behavior </w:t>
       </w:r>
     </w:p>
     <w:p>

</xml_diff>

<commit_message>
Connecting the sign up button in Login Form with Sign Up Page
</commit_message>
<xml_diff>
--- a/finishing with the last fixes.docx
+++ b/finishing with the last fixes.docx
@@ -324,9 +324,27 @@
           <w:ilvl w:val="0"/>
           <w:numId w:val="1"/>
         </w:numPr>
-      </w:pPr>
-      <w:r>
-        <w:t xml:space="preserve">Orders V2 data model </w:t>
+        <w:rPr>
+          <w:lang w:val="en-US"/>
+        </w:rPr>
+      </w:pPr>
+      <w:r>
+        <w:rPr>
+          <w:lang w:val="en-US"/>
+        </w:rPr>
+        <w:t>Orders V2 data model</w:t>
+      </w:r>
+      <w:r>
+        <w:rPr>
+          <w:lang w:val="en-US"/>
+        </w:rPr>
+        <w:t xml:space="preserve"> [DONE].</w:t>
+      </w:r>
+      <w:r>
+        <w:rPr>
+          <w:lang w:val="en-US"/>
+        </w:rPr>
+        <w:t xml:space="preserve"> </w:t>
       </w:r>
     </w:p>
     <w:p>
@@ -339,6 +357,9 @@
       <w:r>
         <w:t xml:space="preserve">Orders service update </w:t>
       </w:r>
+      <w:r>
+        <w:t>[DONE]</w:t>
+      </w:r>
     </w:p>
     <w:p>
       <w:pPr>
@@ -350,6 +371,9 @@
       <w:r>
         <w:t xml:space="preserve">OrderCard update </w:t>
       </w:r>
+      <w:r>
+        <w:t>[DONE]</w:t>
+      </w:r>
     </w:p>
     <w:p>
       <w:pPr>
@@ -357,9 +381,27 @@
           <w:ilvl w:val="0"/>
           <w:numId w:val="1"/>
         </w:numPr>
-      </w:pPr>
-      <w:r>
-        <w:t xml:space="preserve">Checkout success order ID </w:t>
+        <w:rPr>
+          <w:lang w:val="en-US"/>
+        </w:rPr>
+      </w:pPr>
+      <w:r>
+        <w:rPr>
+          <w:lang w:val="en-US"/>
+        </w:rPr>
+        <w:t>Checkout success order ID</w:t>
+      </w:r>
+      <w:r>
+        <w:rPr>
+          <w:lang w:val="en-US"/>
+        </w:rPr>
+        <w:t xml:space="preserve"> [DONE]</w:t>
+      </w:r>
+      <w:r>
+        <w:rPr>
+          <w:lang w:val="en-US"/>
+        </w:rPr>
+        <w:t xml:space="preserve"> </w:t>
       </w:r>
     </w:p>
     <w:p>
@@ -390,9 +432,21 @@
           <w:ilvl w:val="0"/>
           <w:numId w:val="2"/>
         </w:numPr>
-      </w:pPr>
-      <w:r>
+        <w:rPr>
+          <w:lang w:val="en-US"/>
+        </w:rPr>
+      </w:pPr>
+      <w:r>
+        <w:rPr>
+          <w:lang w:val="en-US"/>
+        </w:rPr>
         <w:t xml:space="preserve">Preserve shipping form values </w:t>
+      </w:r>
+      <w:r>
+        <w:rPr>
+          <w:lang w:val="en-US"/>
+        </w:rPr>
+        <w:t>[DONE]</w:t>
       </w:r>
     </w:p>
     <w:p>
@@ -405,6 +459,9 @@
       <w:r>
         <w:t xml:space="preserve">Preserve payment values </w:t>
       </w:r>
+      <w:r>
+        <w:t>[DONE]</w:t>
+      </w:r>
     </w:p>
     <w:p>
       <w:pPr>
@@ -412,9 +469,21 @@
           <w:ilvl w:val="0"/>
           <w:numId w:val="2"/>
         </w:numPr>
-      </w:pPr>
-      <w:r>
-        <w:t xml:space="preserve">Hide undefined product fields </w:t>
+        <w:rPr>
+          <w:lang w:val="en-US"/>
+        </w:rPr>
+      </w:pPr>
+      <w:r>
+        <w:rPr>
+          <w:lang w:val="en-US"/>
+        </w:rPr>
+        <w:t>Hide undefined product fields</w:t>
+      </w:r>
+      <w:r>
+        <w:rPr>
+          <w:lang w:val="en-US"/>
+        </w:rPr>
+        <w:t xml:space="preserve"> [DONE]</w:t>
       </w:r>
     </w:p>
     <w:p>
@@ -450,6 +519,9 @@
       <w:r>
         <w:t xml:space="preserve">Better cart badge </w:t>
       </w:r>
+      <w:r>
+        <w:t>[UNNECESSARY]</w:t>
+      </w:r>
     </w:p>
     <w:p>
       <w:pPr>
@@ -457,9 +529,21 @@
           <w:ilvl w:val="0"/>
           <w:numId w:val="3"/>
         </w:numPr>
-      </w:pPr>
-      <w:r>
+        <w:rPr>
+          <w:lang w:val="en-US"/>
+        </w:rPr>
+      </w:pPr>
+      <w:r>
+        <w:rPr>
+          <w:lang w:val="en-US"/>
+        </w:rPr>
         <w:t xml:space="preserve">Recent 3 orders on profile </w:t>
+      </w:r>
+      <w:r>
+        <w:rPr>
+          <w:lang w:val="en-US"/>
+        </w:rPr>
+        <w:t>[DONE]</w:t>
       </w:r>
     </w:p>
     <w:p>
@@ -471,6 +555,9 @@
       </w:pPr>
       <w:r>
         <w:t xml:space="preserve">Order card click behavior </w:t>
+      </w:r>
+      <w:r>
+        <w:t>[DONE]</w:t>
       </w:r>
     </w:p>
     <w:p>

</xml_diff>